<commit_message>
Upgrade AI review repurposing launch pack
</commit_message>
<xml_diff>
--- a/content/member-assets/review-testimonial-service/ai-automation-pack.docx
+++ b/content/member-assets/review-testimonial-service/ai-automation-pack.docx
@@ -23,7 +23,7 @@
         <w:pStyle w:val="Heading2"/>
       </w:pPr>
       <w:r>
-        <w:t xml:space="preserve">Review Reply + Testimonial Clips</w:t>
+        <w:t xml:space="preserve">AI Review Repurposing Service</w:t>
       </w:r>
     </w:p>
     <w:p>
@@ -39,7 +39,7 @@
         <w:pStyle w:val="Tagline"/>
       </w:pPr>
       <w:r>
-        <w:t xml:space="preserve">Turn boring customer reviews into sales assets.</w:t>
+        <w:t xml:space="preserve">Turn one customer review into replies, website proof, email copy, and social content.</w:t>
       </w:r>
     </w:p>
     <w:p>
@@ -845,7 +845,7 @@
               <w:pStyle w:val="TableCell"/>
             </w:pPr>
             <w:r>
-              <w:t xml:space="preserve">Daily lead triage - runs every weekday morning - You are an intake assistant for a review reply + testimonial clips serving local…</w:t>
+              <w:t xml:space="preserve">Daily lead triage - runs every weekday morning - You are an intake assistant for a ai review repurposing service serving local businesses…</w:t>
             </w:r>
           </w:p>
         </w:tc>
@@ -887,7 +887,7 @@
               <w:pStyle w:val="TableCell"/>
             </w:pPr>
             <w:r>
-              <w:t xml:space="preserve">Weekly prospect list - runs every Monday - You are a local lead researcher for a review reply + testimonial clips. Target buyer: Local…</w:t>
+              <w:t xml:space="preserve">Weekly prospect list - runs every Monday - You are a local lead researcher for a ai review repurposing service. Target buyer: Local…</w:t>
             </w:r>
           </w:p>
         </w:tc>
@@ -931,7 +931,7 @@
               <w:pStyle w:val="TableCell"/>
             </w:pPr>
             <w:r>
-              <w:t xml:space="preserve">Outreach drafting prompt - runs twice a week - You write first-contact outreach for a review reply + testimonial clips aimed at local…</w:t>
+              <w:t xml:space="preserve">Outreach drafting prompt - runs twice a week - You write first-contact outreach for a ai review repurposing service aimed at local…</w:t>
             </w:r>
           </w:p>
         </w:tc>
@@ -1017,7 +1017,7 @@
               <w:pStyle w:val="TableCell"/>
             </w:pPr>
             <w:r>
-              <w:t xml:space="preserve">Delivery QA prompt - runs before every handoff - You are a delivery reviewer for a review reply + testimonial clips. Here is the draft…</w:t>
+              <w:t xml:space="preserve">Delivery QA prompt - runs before every handoff - You are a delivery reviewer for a ai review repurposing service. Here is the draft…</w:t>
             </w:r>
           </w:p>
         </w:tc>
@@ -1059,7 +1059,7 @@
               <w:pStyle w:val="TableCell"/>
             </w:pPr>
             <w:r>
-              <w:t xml:space="preserve">Weekly report and client update - runs every Friday - You report on a review reply + testimonial clips. Here is this week's activity: [prospects…</w:t>
+              <w:t xml:space="preserve">Weekly report and client update - runs every Friday - You report on a ai review repurposing service. Here is this week's activity: [prospects…</w:t>
             </w:r>
           </w:p>
         </w:tc>
@@ -1103,7 +1103,7 @@
               <w:pStyle w:val="TableCell"/>
             </w:pPr>
             <w:r>
-              <w:t xml:space="preserve">Proof and referral repurposing - runs after each completed job - You repurpose finished work for a review reply + testimonial clips. Here are the job…</w:t>
+              <w:t xml:space="preserve">Proof and referral repurposing - runs after each completed job - You repurpose finished work for a ai review repurposing service. Here are the job details…</w:t>
             </w:r>
           </w:p>
         </w:tc>
@@ -1628,7 +1628,7 @@
         <w:pStyle w:val="ExampleBlock"/>
       </w:pPr>
       <w:r>
-        <w:t xml:space="preserve">You are an intake assistant for a review reply + testimonial clips serving local businesses. Here are the new enquiries from the last 24 hours: [paste messages]. For each one, return a row with: sender, channel, intent (new job / question / complaint / spam), urgency (high/medium/low), the single missing detail to ask for, and a one-line suggested reply. Do not send anything. Put any urgent or safety-related message at the top for immediate human review.</w:t>
+        <w:t xml:space="preserve">You are an intake assistant for a ai review repurposing service serving local businesses. Here are the new enquiries from the last 24 hours: [paste messages]. For each one, return a row with: sender, channel, intent (new job / question / complaint / spam), urgency (high/medium/low), the single missing detail to ask for, and a one-line suggested reply. Do not send anything. Put any urgent or safety-related message at the top for immediate human review.</w:t>
       </w:r>
     </w:p>
     <w:p>
@@ -1644,7 +1644,7 @@
         <w:pStyle w:val="ExampleBlock"/>
       </w:pPr>
       <w:r>
-        <w:t xml:space="preserve">You are a local lead researcher for a review reply + testimonial clips. Target buyer: Local businesses. Using [area / suburb / list source], produce 10 prospects who visibly have the problem this service solves. Return a table: name, location, the visible problem you would reference, the best first channel, and a one-line opener. Exclude anyone who looks high-risk, delicate, or out of scope.</w:t>
+        <w:t xml:space="preserve">You are a local lead researcher for a ai review repurposing service. Target buyer: Local businesses. Using [area / suburb / list source], produce 10 prospects who visibly have the problem this service solves. Return a table: name, location, the visible problem you would reference, the best first channel, and a one-line opener. Exclude anyone who looks high-risk, delicate, or out of scope.</w:t>
       </w:r>
     </w:p>
     <w:p>
@@ -1660,7 +1660,7 @@
         <w:pStyle w:val="ExampleBlock"/>
       </w:pPr>
       <w:r>
-        <w:t xml:space="preserve">You write first-contact outreach for a review reply + testimonial clips aimed at local businesses. Here is the prospect list: [paste rows]. For each prospect, draft a short, specific message that names the visible problem, offers the fixed-scope starter, and asks one easy yes/no question. Keep it under 90 words, with no hype and no guarantees. Return each draft labelled by prospect for human review before sending.</w:t>
+        <w:t xml:space="preserve">You write first-contact outreach for a ai review repurposing service aimed at local businesses. Here is the prospect list: [paste rows]. For each prospect, draft a short, specific message that names the visible problem, offers the fixed-scope starter, and asks one easy yes/no question. Keep it under 90 words, with no hype and no guarantees. Return each draft labelled by prospect for human review before sending.</w:t>
       </w:r>
     </w:p>
     <w:p>
@@ -1692,7 +1692,7 @@
         <w:pStyle w:val="ExampleBlock"/>
       </w:pPr>
       <w:r>
-        <w:t xml:space="preserve">You are a delivery reviewer for a review reply + testimonial clips. Here is the draft deliverable: [paste]. Check it against this standard: every fact, price, date, and claim is verifiable; nothing promises guaranteed results; the buyer can act within 30 seconds; every bracketed placeholder is replaced. Return a pass/fix list with the exact lines to change, then return it to the human owner instead of sending.</w:t>
+        <w:t xml:space="preserve">You are a delivery reviewer for a ai review repurposing service. Here is the draft deliverable: [paste]. Check it against this standard: every fact, price, date, and claim is verifiable; nothing promises guaranteed results; the buyer can act within 30 seconds; every bracketed placeholder is replaced. Return a pass/fix list with the exact lines to change, then return it to the human owner instead of sending.</w:t>
       </w:r>
     </w:p>
     <w:p>
@@ -1708,7 +1708,7 @@
         <w:pStyle w:val="ExampleBlock"/>
       </w:pPr>
       <w:r>
-        <w:t xml:space="preserve">You report on a review reply + testimonial clips. Here is this week's activity: [prospects contacted, replies, jobs booked, jobs delivered, revenue, issues]. Produce two outputs: (1) an internal summary with the top three numbers and the one bottleneck to fix next week; (2) a short, friendly update for each active client stating what was done, what is next, and any approval needed. Keep every claim factual and flag anything that needs owner approval.</w:t>
+        <w:t xml:space="preserve">You report on a ai review repurposing service. Here is this week's activity: [prospects contacted, replies, jobs booked, jobs delivered, revenue, issues]. Produce two outputs: (1) an internal summary with the top three numbers and the one bottleneck to fix next week; (2) a short, friendly update for each active client stating what was done, what is next, and any approval needed. Keep every claim factual and flag anything that needs owner approval.</w:t>
       </w:r>
     </w:p>
     <w:p>
@@ -1724,7 +1724,7 @@
         <w:pStyle w:val="ExampleBlock"/>
       </w:pPr>
       <w:r>
-        <w:t xml:space="preserve">You repurpose finished work for a review reply + testimonial clips. Here are the job details and before/after notes: [paste]. Draft: one social caption with the result and a soft call to action, one short message asking the client for a referral or review, and one line to add this example to the outreach sample library. Do not invent results or show identifying details without approval.</w:t>
+        <w:t xml:space="preserve">You repurpose finished work for a ai review repurposing service. Here are the job details and before/after notes: [paste]. Draft: one social caption with the result and a soft call to action, one short message asking the client for a referral or review, and one line to add this example to the outreach sample library. Do not invent results or show identifying details without approval.</w:t>
       </w:r>
     </w:p>
     <w:p>
@@ -1821,7 +1821,7 @@
         <w:sz w:val="16"/>
         <w:color w:val="57534E"/>
       </w:rPr>
-      <w:t xml:space="preserve">Side Hustle Stephen / Review Reply + Testimonial Clips / Page </w:t>
+      <w:t xml:space="preserve">Side Hustle Stephen / AI Review Repurposing Service / Page </w:t>
     </w:r>
     <w:r>
       <w:rPr>

</xml_diff>

<commit_message>
Improve review pack and conversion funnel
</commit_message>
<xml_diff>
--- a/content/member-assets/review-testimonial-service/ai-automation-pack.docx
+++ b/content/member-assets/review-testimonial-service/ai-automation-pack.docx
@@ -31,7 +31,7 @@
         <w:pStyle w:val="Lead"/>
       </w:pPr>
       <w:r>
-        <w:t xml:space="preserve">Scheduled AI-agent prompts for this service: daily lead triage, weekly prospecting, outreach drafting, follow-ups, delivery QA, weekly reporting, and proof repurposing - each ready to paste into an agent and run on a cadence with human approval.</w:t>
+        <w:t xml:space="preserve">Scheduled review-service workflows for weekly review collection, risk classification, owner-voice reply drafts, exact-quote permission checks, monthly testimonial content packs, approval emails, and first-20-leads research. Every public reply and proof asset stays behind human approval.</w:t>
       </w:r>
     </w:p>
     <w:p>
@@ -673,13 +673,13 @@
         <w:tblLook w:firstRow="1" w:noHBand="0" w:noVBand="1"/>
       </w:tblPr>
       <w:tblGrid>
-        <w:gridCol w:w="1180"/>
-        <w:gridCol w:w="7940"/>
+        <w:gridCol w:w="1500"/>
+        <w:gridCol w:w="7620"/>
       </w:tblGrid>
       <w:tr>
         <w:tc>
           <w:tcPr>
-            <w:tcW w:w="1180" w:type="dxa"/>
+            <w:tcW w:w="1500" w:type="dxa"/>
             <w:shd w:fill="0A0A0A"/>
             <w:tcMar>
               <w:top w:w="120" w:type="dxa"/>
@@ -700,7 +700,7 @@
         </w:tc>
         <w:tc>
           <w:tcPr>
-            <w:tcW w:w="7940" w:type="dxa"/>
+            <w:tcW w:w="7620" w:type="dxa"/>
             <w:shd w:fill="0A0A0A"/>
             <w:tcMar>
               <w:top w:w="120" w:type="dxa"/>
@@ -723,7 +723,7 @@
       <w:tr>
         <w:tc>
           <w:tcPr>
-            <w:tcW w:w="1180" w:type="dxa"/>
+            <w:tcW w:w="1500" w:type="dxa"/>
             <w:shd w:fill="F5F3F1"/>
             <w:tcMar>
               <w:top w:w="120" w:type="dxa"/>
@@ -744,30 +744,30 @@
         </w:tc>
         <w:tc>
           <w:tcPr>
-            <w:tcW w:w="7940" w:type="dxa"/>
-            <w:shd w:fill="F5F3F1"/>
-            <w:tcMar>
-              <w:top w:w="120" w:type="dxa"/>
-              <w:left w:w="150" w:type="dxa"/>
-              <w:bottom w:w="120" w:type="dxa"/>
-              <w:right w:w="150" w:type="dxa"/>
-            </w:tcMar>
-            <w:vAlign w:val="center"/>
-          </w:tcPr>
-          <w:p>
-            <w:pPr>
-              <w:pStyle w:val="TableCell"/>
-            </w:pPr>
-            <w:r>
-              <w:t xml:space="preserve">How to use these automations - Each automation below is a ready prompt you can paste into an AI agent (ChatGPT, Claude, or…</w:t>
-            </w:r>
-          </w:p>
-        </w:tc>
-      </w:tr>
-      <w:tr>
-        <w:tc>
-          <w:tcPr>
-            <w:tcW w:w="1180" w:type="dxa"/>
+            <w:tcW w:w="7620" w:type="dxa"/>
+            <w:shd w:fill="F5F3F1"/>
+            <w:tcMar>
+              <w:top w:w="120" w:type="dxa"/>
+              <w:left w:w="150" w:type="dxa"/>
+              <w:bottom w:w="120" w:type="dxa"/>
+              <w:right w:w="150" w:type="dxa"/>
+            </w:tcMar>
+            <w:vAlign w:val="center"/>
+          </w:tcPr>
+          <w:p>
+            <w:pPr>
+              <w:pStyle w:val="TableCell"/>
+            </w:pPr>
+            <w:r>
+              <w:t xml:space="preserve">The simplest reliable stack - Review source: the client's approved Google Business Profile, Facebook page, marketplace…</w:t>
+            </w:r>
+          </w:p>
+        </w:tc>
+      </w:tr>
+      <w:tr>
+        <w:tc>
+          <w:tcPr>
+            <w:tcW w:w="1500" w:type="dxa"/>
             <w:tcMar>
               <w:top w:w="120" w:type="dxa"/>
               <w:left w:w="150" w:type="dxa"/>
@@ -787,29 +787,29 @@
         </w:tc>
         <w:tc>
           <w:tcPr>
-            <w:tcW w:w="7940" w:type="dxa"/>
-            <w:tcMar>
-              <w:top w:w="120" w:type="dxa"/>
-              <w:left w:w="150" w:type="dxa"/>
-              <w:bottom w:w="120" w:type="dxa"/>
-              <w:right w:w="150" w:type="dxa"/>
-            </w:tcMar>
-            <w:vAlign w:val="center"/>
-          </w:tcPr>
-          <w:p>
-            <w:pPr>
-              <w:pStyle w:val="TableCell"/>
-            </w:pPr>
-            <w:r>
-              <w:t xml:space="preserve">Automation schedule - Daily lead triage: every weekday morning.</w:t>
-            </w:r>
-          </w:p>
-        </w:tc>
-      </w:tr>
-      <w:tr>
-        <w:tc>
-          <w:tcPr>
-            <w:tcW w:w="1180" w:type="dxa"/>
+            <w:tcW w:w="7620" w:type="dxa"/>
+            <w:tcMar>
+              <w:top w:w="120" w:type="dxa"/>
+              <w:left w:w="150" w:type="dxa"/>
+              <w:bottom w:w="120" w:type="dxa"/>
+              <w:right w:w="150" w:type="dxa"/>
+            </w:tcMar>
+            <w:vAlign w:val="center"/>
+          </w:tcPr>
+          <w:p>
+            <w:pPr>
+              <w:pStyle w:val="TableCell"/>
+            </w:pPr>
+            <w:r>
+              <w:t xml:space="preserve">Minimum viable weekly loop - 1. Collect: import only new reviews from the agreed public sources or client export.</w:t>
+            </w:r>
+          </w:p>
+        </w:tc>
+      </w:tr>
+      <w:tr>
+        <w:tc>
+          <w:tcPr>
+            <w:tcW w:w="1500" w:type="dxa"/>
             <w:shd w:fill="F5F3F1"/>
             <w:tcMar>
               <w:top w:w="120" w:type="dxa"/>
@@ -830,30 +830,30 @@
         </w:tc>
         <w:tc>
           <w:tcPr>
-            <w:tcW w:w="7940" w:type="dxa"/>
-            <w:shd w:fill="F5F3F1"/>
-            <w:tcMar>
-              <w:top w:w="120" w:type="dxa"/>
-              <w:left w:w="150" w:type="dxa"/>
-              <w:bottom w:w="120" w:type="dxa"/>
-              <w:right w:w="150" w:type="dxa"/>
-            </w:tcMar>
-            <w:vAlign w:val="center"/>
-          </w:tcPr>
-          <w:p>
-            <w:pPr>
-              <w:pStyle w:val="TableCell"/>
-            </w:pPr>
-            <w:r>
-              <w:t xml:space="preserve">Daily lead triage - runs every weekday morning - You are an intake assistant for a ai review repurposing service serving local businesses…</w:t>
-            </w:r>
-          </w:p>
-        </w:tc>
-      </w:tr>
-      <w:tr>
-        <w:tc>
-          <w:tcPr>
-            <w:tcW w:w="1180" w:type="dxa"/>
+            <w:tcW w:w="7620" w:type="dxa"/>
+            <w:shd w:fill="F5F3F1"/>
+            <w:tcMar>
+              <w:top w:w="120" w:type="dxa"/>
+              <w:left w:w="150" w:type="dxa"/>
+              <w:bottom w:w="120" w:type="dxa"/>
+              <w:right w:w="150" w:type="dxa"/>
+            </w:tcMar>
+            <w:vAlign w:val="center"/>
+          </w:tcPr>
+          <w:p>
+            <w:pPr>
+              <w:pStyle w:val="TableCell"/>
+            </w:pPr>
+            <w:r>
+              <w:t xml:space="preserve">Scheduled review sweep prompt - Review the new items in [APPROVED REVIEW EXPORT OR LINKS] for [BUSINESS]. Return one row…</w:t>
+            </w:r>
+          </w:p>
+        </w:tc>
+      </w:tr>
+      <w:tr>
+        <w:tc>
+          <w:tcPr>
+            <w:tcW w:w="1500" w:type="dxa"/>
             <w:tcMar>
               <w:top w:w="120" w:type="dxa"/>
               <w:left w:w="150" w:type="dxa"/>
@@ -873,29 +873,29 @@
         </w:tc>
         <w:tc>
           <w:tcPr>
-            <w:tcW w:w="7940" w:type="dxa"/>
-            <w:tcMar>
-              <w:top w:w="120" w:type="dxa"/>
-              <w:left w:w="150" w:type="dxa"/>
-              <w:bottom w:w="120" w:type="dxa"/>
-              <w:right w:w="150" w:type="dxa"/>
-            </w:tcMar>
-            <w:vAlign w:val="center"/>
-          </w:tcPr>
-          <w:p>
-            <w:pPr>
-              <w:pStyle w:val="TableCell"/>
-            </w:pPr>
-            <w:r>
-              <w:t xml:space="preserve">Weekly prospect list - runs every Monday - You are a local lead researcher for a ai review repurposing service. Target buyer: Local…</w:t>
-            </w:r>
-          </w:p>
-        </w:tc>
-      </w:tr>
-      <w:tr>
-        <w:tc>
-          <w:tcPr>
-            <w:tcW w:w="1180" w:type="dxa"/>
+            <w:tcW w:w="7620" w:type="dxa"/>
+            <w:tcMar>
+              <w:top w:w="120" w:type="dxa"/>
+              <w:left w:w="150" w:type="dxa"/>
+              <w:bottom w:w="120" w:type="dxa"/>
+              <w:right w:w="150" w:type="dxa"/>
+            </w:tcMar>
+            <w:vAlign w:val="center"/>
+          </w:tcPr>
+          <w:p>
+            <w:pPr>
+              <w:pStyle w:val="TableCell"/>
+            </w:pPr>
+            <w:r>
+              <w:t xml:space="preserve">Exact-quote and permission gate - Compare every proposed testimonial line against its source review. Return PASS only when…</w:t>
+            </w:r>
+          </w:p>
+        </w:tc>
+      </w:tr>
+      <w:tr>
+        <w:tc>
+          <w:tcPr>
+            <w:tcW w:w="1500" w:type="dxa"/>
             <w:shd w:fill="F5F3F1"/>
             <w:tcMar>
               <w:top w:w="120" w:type="dxa"/>
@@ -916,30 +916,30 @@
         </w:tc>
         <w:tc>
           <w:tcPr>
-            <w:tcW w:w="7940" w:type="dxa"/>
-            <w:shd w:fill="F5F3F1"/>
-            <w:tcMar>
-              <w:top w:w="120" w:type="dxa"/>
-              <w:left w:w="150" w:type="dxa"/>
-              <w:bottom w:w="120" w:type="dxa"/>
-              <w:right w:w="150" w:type="dxa"/>
-            </w:tcMar>
-            <w:vAlign w:val="center"/>
-          </w:tcPr>
-          <w:p>
-            <w:pPr>
-              <w:pStyle w:val="TableCell"/>
-            </w:pPr>
-            <w:r>
-              <w:t xml:space="preserve">Outreach drafting prompt - runs twice a week - You write first-contact outreach for a ai review repurposing service aimed at local…</w:t>
-            </w:r>
-          </w:p>
-        </w:tc>
-      </w:tr>
-      <w:tr>
-        <w:tc>
-          <w:tcPr>
-            <w:tcW w:w="1180" w:type="dxa"/>
+            <w:tcW w:w="7620" w:type="dxa"/>
+            <w:shd w:fill="F5F3F1"/>
+            <w:tcMar>
+              <w:top w:w="120" w:type="dxa"/>
+              <w:left w:w="150" w:type="dxa"/>
+              <w:bottom w:w="120" w:type="dxa"/>
+              <w:right w:w="150" w:type="dxa"/>
+            </w:tcMar>
+            <w:vAlign w:val="center"/>
+          </w:tcPr>
+          <w:p>
+            <w:pPr>
+              <w:pStyle w:val="TableCell"/>
+            </w:pPr>
+            <w:r>
+              <w:t xml:space="preserve">Monthly content pack prompt - Using only APPROVED rows in [CONTROL SHEET], prepare this month's client pack: reply…</w:t>
+            </w:r>
+          </w:p>
+        </w:tc>
+      </w:tr>
+      <w:tr>
+        <w:tc>
+          <w:tcPr>
+            <w:tcW w:w="1500" w:type="dxa"/>
             <w:tcMar>
               <w:top w:w="120" w:type="dxa"/>
               <w:left w:w="150" w:type="dxa"/>
@@ -959,29 +959,29 @@
         </w:tc>
         <w:tc>
           <w:tcPr>
-            <w:tcW w:w="7940" w:type="dxa"/>
-            <w:tcMar>
-              <w:top w:w="120" w:type="dxa"/>
-              <w:left w:w="150" w:type="dxa"/>
-              <w:bottom w:w="120" w:type="dxa"/>
-              <w:right w:w="150" w:type="dxa"/>
-            </w:tcMar>
-            <w:vAlign w:val="center"/>
-          </w:tcPr>
-          <w:p>
-            <w:pPr>
-              <w:pStyle w:val="TableCell"/>
-            </w:pPr>
-            <w:r>
-              <w:t xml:space="preserve">Follow-up sequencer prompt - runs every weekday - You manage polite follow-ups. Here are prospects with no reply and the days since first…</w:t>
-            </w:r>
-          </w:p>
-        </w:tc>
-      </w:tr>
-      <w:tr>
-        <w:tc>
-          <w:tcPr>
-            <w:tcW w:w="1180" w:type="dxa"/>
+            <w:tcW w:w="7620" w:type="dxa"/>
+            <w:tcMar>
+              <w:top w:w="120" w:type="dxa"/>
+              <w:left w:w="150" w:type="dxa"/>
+              <w:bottom w:w="120" w:type="dxa"/>
+              <w:right w:w="150" w:type="dxa"/>
+            </w:tcMar>
+            <w:vAlign w:val="center"/>
+          </w:tcPr>
+          <w:p>
+            <w:pPr>
+              <w:pStyle w:val="TableCell"/>
+            </w:pPr>
+            <w:r>
+              <w:t xml:space="preserve">Approval email draft - Draft one email to [APPROVAL OWNER] linking the review log and content pack. Group items…</w:t>
+            </w:r>
+          </w:p>
+        </w:tc>
+      </w:tr>
+      <w:tr>
+        <w:tc>
+          <w:tcPr>
+            <w:tcW w:w="1500" w:type="dxa"/>
             <w:shd w:fill="F5F3F1"/>
             <w:tcMar>
               <w:top w:w="120" w:type="dxa"/>
@@ -1002,30 +1002,30 @@
         </w:tc>
         <w:tc>
           <w:tcPr>
-            <w:tcW w:w="7940" w:type="dxa"/>
-            <w:shd w:fill="F5F3F1"/>
-            <w:tcMar>
-              <w:top w:w="120" w:type="dxa"/>
-              <w:left w:w="150" w:type="dxa"/>
-              <w:bottom w:w="120" w:type="dxa"/>
-              <w:right w:w="150" w:type="dxa"/>
-            </w:tcMar>
-            <w:vAlign w:val="center"/>
-          </w:tcPr>
-          <w:p>
-            <w:pPr>
-              <w:pStyle w:val="TableCell"/>
-            </w:pPr>
-            <w:r>
-              <w:t xml:space="preserve">Delivery QA prompt - runs before every handoff - You are a delivery reviewer for a ai review repurposing service. Here is the draft…</w:t>
-            </w:r>
-          </w:p>
-        </w:tc>
-      </w:tr>
-      <w:tr>
-        <w:tc>
-          <w:tcPr>
-            <w:tcW w:w="1180" w:type="dxa"/>
+            <w:tcW w:w="7620" w:type="dxa"/>
+            <w:shd w:fill="F5F3F1"/>
+            <w:tcMar>
+              <w:top w:w="120" w:type="dxa"/>
+              <w:left w:w="150" w:type="dxa"/>
+              <w:bottom w:w="120" w:type="dxa"/>
+              <w:right w:w="150" w:type="dxa"/>
+            </w:tcMar>
+            <w:vAlign w:val="center"/>
+          </w:tcPr>
+          <w:p>
+            <w:pPr>
+              <w:pStyle w:val="TableCell"/>
+            </w:pPr>
+            <w:r>
+              <w:t xml:space="preserve">First 20 leads routine - Once a week, review 20 public local-business profiles in [AREA OR NICHE]. Return only…</w:t>
+            </w:r>
+          </w:p>
+        </w:tc>
+      </w:tr>
+      <w:tr>
+        <w:tc>
+          <w:tcPr>
+            <w:tcW w:w="1500" w:type="dxa"/>
             <w:tcMar>
               <w:top w:w="120" w:type="dxa"/>
               <w:left w:w="150" w:type="dxa"/>
@@ -1045,29 +1045,29 @@
         </w:tc>
         <w:tc>
           <w:tcPr>
-            <w:tcW w:w="7940" w:type="dxa"/>
-            <w:tcMar>
-              <w:top w:w="120" w:type="dxa"/>
-              <w:left w:w="150" w:type="dxa"/>
-              <w:bottom w:w="120" w:type="dxa"/>
-              <w:right w:w="150" w:type="dxa"/>
-            </w:tcMar>
-            <w:vAlign w:val="center"/>
-          </w:tcPr>
-          <w:p>
-            <w:pPr>
-              <w:pStyle w:val="TableCell"/>
-            </w:pPr>
-            <w:r>
-              <w:t xml:space="preserve">Weekly report and client update - runs every Friday - You report on a ai review repurposing service. Here is this week's activity: [prospects…</w:t>
-            </w:r>
-          </w:p>
-        </w:tc>
-      </w:tr>
-      <w:tr>
-        <w:tc>
-          <w:tcPr>
-            <w:tcW w:w="1180" w:type="dxa"/>
+            <w:tcW w:w="7620" w:type="dxa"/>
+            <w:tcMar>
+              <w:top w:w="120" w:type="dxa"/>
+              <w:left w:w="150" w:type="dxa"/>
+              <w:bottom w:w="120" w:type="dxa"/>
+              <w:right w:w="150" w:type="dxa"/>
+            </w:tcMar>
+            <w:vAlign w:val="center"/>
+          </w:tcPr>
+          <w:p>
+            <w:pPr>
+              <w:pStyle w:val="TableCell"/>
+            </w:pPr>
+            <w:r>
+              <w:t xml:space="preserve">Failure and safety rules - Stop when the review source cannot be verified, wording is ambiguous, a complaint includes…</w:t>
+            </w:r>
+          </w:p>
+        </w:tc>
+      </w:tr>
+      <w:tr>
+        <w:tc>
+          <w:tcPr>
+            <w:tcW w:w="1500" w:type="dxa"/>
             <w:shd w:fill="F5F3F1"/>
             <w:tcMar>
               <w:top w:w="120" w:type="dxa"/>
@@ -1088,50 +1088,8 @@
         </w:tc>
         <w:tc>
           <w:tcPr>
-            <w:tcW w:w="7940" w:type="dxa"/>
-            <w:shd w:fill="F5F3F1"/>
-            <w:tcMar>
-              <w:top w:w="120" w:type="dxa"/>
-              <w:left w:w="150" w:type="dxa"/>
-              <w:bottom w:w="120" w:type="dxa"/>
-              <w:right w:w="150" w:type="dxa"/>
-            </w:tcMar>
-            <w:vAlign w:val="center"/>
-          </w:tcPr>
-          <w:p>
-            <w:pPr>
-              <w:pStyle w:val="TableCell"/>
-            </w:pPr>
-            <w:r>
-              <w:t xml:space="preserve">Proof and referral repurposing - runs after each completed job - You repurpose finished work for a ai review repurposing service. Here are the job details…</w:t>
-            </w:r>
-          </w:p>
-        </w:tc>
-      </w:tr>
-      <w:tr>
-        <w:tc>
-          <w:tcPr>
-            <w:tcW w:w="1180" w:type="dxa"/>
-            <w:tcMar>
-              <w:top w:w="120" w:type="dxa"/>
-              <w:left w:w="150" w:type="dxa"/>
-              <w:bottom w:w="120" w:type="dxa"/>
-              <w:right w:w="150" w:type="dxa"/>
-            </w:tcMar>
-            <w:vAlign w:val="center"/>
-          </w:tcPr>
-          <w:p>
-            <w:pPr>
-              <w:pStyle w:val="TableCell"/>
-            </w:pPr>
-            <w:r>
-              <w:t xml:space="preserve">10</w:t>
-            </w:r>
-          </w:p>
-        </w:tc>
-        <w:tc>
-          <w:tcPr>
-            <w:tcW w:w="7940" w:type="dxa"/>
+            <w:tcW w:w="7620" w:type="dxa"/>
+            <w:shd w:fill="F5F3F1"/>
             <w:tcMar>
               <w:top w:w="120" w:type="dxa"/>
               <w:left w:w="150" w:type="dxa"/>
@@ -1188,63 +1146,7 @@
         <w:pStyle w:val="Heading1"/>
       </w:pPr>
       <w:r>
-        <w:t xml:space="preserve">01 / How to use these automations</w:t>
-      </w:r>
-    </w:p>
-    <w:p>
-      <w:pPr>
-        <w:pStyle w:val="ListParagraph"/>
-        <w:numPr>
-          <w:ilvl w:val="0"/>
-          <w:numId w:val="1"/>
-        </w:numPr>
-      </w:pPr>
-      <w:r>
-        <w:t xml:space="preserve">Each automation below is a ready prompt you can paste into an AI agent (ChatGPT, Claude, or an agent platform) and run on a schedule.</w:t>
-      </w:r>
-    </w:p>
-    <w:p>
-      <w:pPr>
-        <w:pStyle w:val="ListParagraph"/>
-        <w:numPr>
-          <w:ilvl w:val="0"/>
-          <w:numId w:val="1"/>
-        </w:numPr>
-      </w:pPr>
-      <w:r>
-        <w:t xml:space="preserve">Give the agent only the inputs shown in [brackets], and keep a human approval step before anything is sent, published, or billed.</w:t>
-      </w:r>
-    </w:p>
-    <w:p>
-      <w:pPr>
-        <w:pStyle w:val="ListParagraph"/>
-        <w:numPr>
-          <w:ilvl w:val="0"/>
-          <w:numId w:val="1"/>
-        </w:numPr>
-      </w:pPr>
-      <w:r>
-        <w:t xml:space="preserve">Start with one automation, prove it for a week, then add the next so you learn to trust each output.</w:t>
-      </w:r>
-    </w:p>
-    <w:p>
-      <w:pPr>
-        <w:pStyle w:val="ListParagraph"/>
-        <w:numPr>
-          <w:ilvl w:val="0"/>
-          <w:numId w:val="1"/>
-        </w:numPr>
-      </w:pPr>
-      <w:r>
-        <w:t xml:space="preserve">Send each output to where you already work: inbox drafts, your CRM, or a shared job doc.</w:t>
-      </w:r>
-    </w:p>
-    <w:p>
-      <w:pPr>
-        <w:pStyle w:val="Heading1"/>
-      </w:pPr>
-      <w:r>
-        <w:t xml:space="preserve">02 / Automation schedule</w:t>
+        <w:t xml:space="preserve">01 / The simplest reliable stack</w:t>
       </w:r>
     </w:p>
     <w:tbl>
@@ -1283,7 +1185,7 @@
               <w:pStyle w:val="TableHeader"/>
             </w:pPr>
             <w:r>
-              <w:t xml:space="preserve">Automation</w:t>
+              <w:t xml:space="preserve">Field</w:t>
             </w:r>
           </w:p>
         </w:tc>
@@ -1304,7 +1206,7 @@
               <w:pStyle w:val="TableHeader"/>
             </w:pPr>
             <w:r>
-              <w:t xml:space="preserve">When to run</w:t>
+              <w:t xml:space="preserve">Detail</w:t>
             </w:r>
           </w:p>
         </w:tc>
@@ -1327,7 +1229,7 @@
               <w:pStyle w:val="TableLabel"/>
             </w:pPr>
             <w:r>
-              <w:t xml:space="preserve">Daily lead triage</w:t>
+              <w:t xml:space="preserve">Review source</w:t>
             </w:r>
           </w:p>
         </w:tc>
@@ -1348,7 +1250,7 @@
               <w:pStyle w:val="TableCell"/>
             </w:pPr>
             <w:r>
-              <w:t xml:space="preserve">every weekday morning.</w:t>
+              <w:t xml:space="preserve">the client's approved Google Business Profile, Facebook page, marketplace profile, or exported review list.</w:t>
             </w:r>
           </w:p>
         </w:tc>
@@ -1371,7 +1273,7 @@
               <w:pStyle w:val="TableLabel"/>
             </w:pPr>
             <w:r>
-              <w:t xml:space="preserve">Weekly prospect list</w:t>
+              <w:t xml:space="preserve">Control sheet</w:t>
             </w:r>
           </w:p>
         </w:tc>
@@ -1391,7 +1293,7 @@
               <w:pStyle w:val="TableCell"/>
             </w:pPr>
             <w:r>
-              <w:t xml:space="preserve">every Monday.</w:t>
+              <w:t xml:space="preserve">one row per review with source URL, date, rating, sentiment, reply status, escalation status, exact quote, approved use, and final asset links.</w:t>
             </w:r>
           </w:p>
         </w:tc>
@@ -1414,7 +1316,7 @@
               <w:pStyle w:val="TableLabel"/>
             </w:pPr>
             <w:r>
-              <w:t xml:space="preserve">Outreach drafting</w:t>
+              <w:t xml:space="preserve">Production</w:t>
             </w:r>
           </w:p>
         </w:tc>
@@ -1435,7 +1337,7 @@
               <w:pStyle w:val="TableCell"/>
             </w:pPr>
             <w:r>
-              <w:t xml:space="preserve">twice a week.</w:t>
+              <w:t xml:space="preserve">one reply template library and one original Canva system for square, story, website, and email proof blocks.</w:t>
             </w:r>
           </w:p>
         </w:tc>
@@ -1458,7 +1360,7 @@
               <w:pStyle w:val="TableLabel"/>
             </w:pPr>
             <w:r>
-              <w:t xml:space="preserve">Follow-up sequencer</w:t>
+              <w:t xml:space="preserve">Automation</w:t>
             </w:r>
           </w:p>
         </w:tc>
@@ -1478,138 +1380,7 @@
               <w:pStyle w:val="TableCell"/>
             </w:pPr>
             <w:r>
-              <w:t xml:space="preserve">every weekday.</w:t>
-            </w:r>
-          </w:p>
-        </w:tc>
-      </w:tr>
-      <w:tr>
-        <w:tc>
-          <w:tcPr>
-            <w:tcW w:w="3000" w:type="dxa"/>
-            <w:shd w:fill="F5F3F1"/>
-            <w:tcMar>
-              <w:top w:w="120" w:type="dxa"/>
-              <w:left w:w="150" w:type="dxa"/>
-              <w:bottom w:w="120" w:type="dxa"/>
-              <w:right w:w="150" w:type="dxa"/>
-            </w:tcMar>
-            <w:vAlign w:val="center"/>
-          </w:tcPr>
-          <w:p>
-            <w:pPr>
-              <w:pStyle w:val="TableLabel"/>
-            </w:pPr>
-            <w:r>
-              <w:t xml:space="preserve">Delivery QA</w:t>
-            </w:r>
-          </w:p>
-        </w:tc>
-        <w:tc>
-          <w:tcPr>
-            <w:tcW w:w="6180" w:type="dxa"/>
-            <w:shd w:fill="F5F3F1"/>
-            <w:tcMar>
-              <w:top w:w="120" w:type="dxa"/>
-              <w:left w:w="150" w:type="dxa"/>
-              <w:bottom w:w="120" w:type="dxa"/>
-              <w:right w:w="150" w:type="dxa"/>
-            </w:tcMar>
-            <w:vAlign w:val="center"/>
-          </w:tcPr>
-          <w:p>
-            <w:pPr>
-              <w:pStyle w:val="TableCell"/>
-            </w:pPr>
-            <w:r>
-              <w:t xml:space="preserve">before every handoff.</w:t>
-            </w:r>
-          </w:p>
-        </w:tc>
-      </w:tr>
-      <w:tr>
-        <w:tc>
-          <w:tcPr>
-            <w:tcW w:w="3000" w:type="dxa"/>
-            <w:shd w:fill="F5F3F1"/>
-            <w:tcMar>
-              <w:top w:w="120" w:type="dxa"/>
-              <w:left w:w="150" w:type="dxa"/>
-              <w:bottom w:w="120" w:type="dxa"/>
-              <w:right w:w="150" w:type="dxa"/>
-            </w:tcMar>
-            <w:vAlign w:val="center"/>
-          </w:tcPr>
-          <w:p>
-            <w:pPr>
-              <w:pStyle w:val="TableLabel"/>
-            </w:pPr>
-            <w:r>
-              <w:t xml:space="preserve">Weekly report and client update</w:t>
-            </w:r>
-          </w:p>
-        </w:tc>
-        <w:tc>
-          <w:tcPr>
-            <w:tcW w:w="6180" w:type="dxa"/>
-            <w:tcMar>
-              <w:top w:w="120" w:type="dxa"/>
-              <w:left w:w="150" w:type="dxa"/>
-              <w:bottom w:w="120" w:type="dxa"/>
-              <w:right w:w="150" w:type="dxa"/>
-            </w:tcMar>
-            <w:vAlign w:val="center"/>
-          </w:tcPr>
-          <w:p>
-            <w:pPr>
-              <w:pStyle w:val="TableCell"/>
-            </w:pPr>
-            <w:r>
-              <w:t xml:space="preserve">every Friday.</w:t>
-            </w:r>
-          </w:p>
-        </w:tc>
-      </w:tr>
-      <w:tr>
-        <w:tc>
-          <w:tcPr>
-            <w:tcW w:w="3000" w:type="dxa"/>
-            <w:shd w:fill="F5F3F1"/>
-            <w:tcMar>
-              <w:top w:w="120" w:type="dxa"/>
-              <w:left w:w="150" w:type="dxa"/>
-              <w:bottom w:w="120" w:type="dxa"/>
-              <w:right w:w="150" w:type="dxa"/>
-            </w:tcMar>
-            <w:vAlign w:val="center"/>
-          </w:tcPr>
-          <w:p>
-            <w:pPr>
-              <w:pStyle w:val="TableLabel"/>
-            </w:pPr>
-            <w:r>
-              <w:t xml:space="preserve">Proof and referral repurposing</w:t>
-            </w:r>
-          </w:p>
-        </w:tc>
-        <w:tc>
-          <w:tcPr>
-            <w:tcW w:w="6180" w:type="dxa"/>
-            <w:shd w:fill="F5F3F1"/>
-            <w:tcMar>
-              <w:top w:w="120" w:type="dxa"/>
-              <w:left w:w="150" w:type="dxa"/>
-              <w:bottom w:w="120" w:type="dxa"/>
-              <w:right w:w="150" w:type="dxa"/>
-            </w:tcMar>
-            <w:vAlign w:val="center"/>
-          </w:tcPr>
-          <w:p>
-            <w:pPr>
-              <w:pStyle w:val="TableCell"/>
-            </w:pPr>
-            <w:r>
-              <w:t xml:space="preserve">after each completed job.</w:t>
+              <w:t xml:space="preserve">a scheduled AI routine can classify, draft, extract, and bundle. A named human still approves every public reply and proof asset before use.</w:t>
             </w:r>
           </w:p>
         </w:tc>
@@ -1620,119 +1391,7 @@
         <w:pStyle w:val="Heading1"/>
       </w:pPr>
       <w:r>
-        <w:t xml:space="preserve">03 / Daily lead triage - runs every weekday morning</w:t>
-      </w:r>
-    </w:p>
-    <w:p>
-      <w:pPr>
-        <w:pStyle w:val="ExampleBlock"/>
-      </w:pPr>
-      <w:r>
-        <w:t xml:space="preserve">You are an intake assistant for a ai review repurposing service serving local businesses. Here are the new enquiries from the last 24 hours: [paste messages]. For each one, return a row with: sender, channel, intent (new job / question / complaint / spam), urgency (high/medium/low), the single missing detail to ask for, and a one-line suggested reply. Do not send anything. Put any urgent or safety-related message at the top for immediate human review.</w:t>
-      </w:r>
-    </w:p>
-    <w:p>
-      <w:pPr>
-        <w:pStyle w:val="Heading1"/>
-      </w:pPr>
-      <w:r>
-        <w:t xml:space="preserve">04 / Weekly prospect list - runs every Monday</w:t>
-      </w:r>
-    </w:p>
-    <w:p>
-      <w:pPr>
-        <w:pStyle w:val="ExampleBlock"/>
-      </w:pPr>
-      <w:r>
-        <w:t xml:space="preserve">You are a local lead researcher for a ai review repurposing service. Target buyer: Local businesses. Using [area / suburb / list source], produce 10 prospects who visibly have the problem this service solves. Return a table: name, location, the visible problem you would reference, the best first channel, and a one-line opener. Exclude anyone who looks high-risk, delicate, or out of scope.</w:t>
-      </w:r>
-    </w:p>
-    <w:p>
-      <w:pPr>
-        <w:pStyle w:val="Heading1"/>
-      </w:pPr>
-      <w:r>
-        <w:t xml:space="preserve">05 / Outreach drafting prompt - runs twice a week</w:t>
-      </w:r>
-    </w:p>
-    <w:p>
-      <w:pPr>
-        <w:pStyle w:val="ExampleBlock"/>
-      </w:pPr>
-      <w:r>
-        <w:t xml:space="preserve">You write first-contact outreach for a ai review repurposing service aimed at local businesses. Here is the prospect list: [paste rows]. For each prospect, draft a short, specific message that names the visible problem, offers the fixed-scope starter, and asks one easy yes/no question. Keep it under 90 words, with no hype and no guarantees. Return each draft labelled by prospect for human review before sending.</w:t>
-      </w:r>
-    </w:p>
-    <w:p>
-      <w:pPr>
-        <w:pStyle w:val="Heading1"/>
-      </w:pPr>
-      <w:r>
-        <w:t xml:space="preserve">06 / Follow-up sequencer prompt - runs every weekday</w:t>
-      </w:r>
-    </w:p>
-    <w:p>
-      <w:pPr>
-        <w:pStyle w:val="ExampleBlock"/>
-      </w:pPr>
-      <w:r>
-        <w:t xml:space="preserve">You manage polite follow-ups. Here are prospects with no reply and the days since first contact: [paste]. For each, draft the next message based on the gap: day 2 adds one new observation or sample, day 5 asks if it is handled internally, day 10 offers a smaller paid starter, day 21 closes the loop. Group drafts by prospect, never chase more than four times, and hold anything that should get a personal human note.</w:t>
-      </w:r>
-    </w:p>
-    <w:p>
-      <w:pPr>
-        <w:pStyle w:val="Heading1"/>
-      </w:pPr>
-      <w:r>
-        <w:t xml:space="preserve">07 / Delivery QA prompt - runs before every handoff</w:t>
-      </w:r>
-    </w:p>
-    <w:p>
-      <w:pPr>
-        <w:pStyle w:val="ExampleBlock"/>
-      </w:pPr>
-      <w:r>
-        <w:t xml:space="preserve">You are a delivery reviewer for a ai review repurposing service. Here is the draft deliverable: [paste]. Check it against this standard: every fact, price, date, and claim is verifiable; nothing promises guaranteed results; the buyer can act within 30 seconds; every bracketed placeholder is replaced. Return a pass/fix list with the exact lines to change, then return it to the human owner instead of sending.</w:t>
-      </w:r>
-    </w:p>
-    <w:p>
-      <w:pPr>
-        <w:pStyle w:val="Heading1"/>
-      </w:pPr>
-      <w:r>
-        <w:t xml:space="preserve">08 / Weekly report and client update - runs every Friday</w:t>
-      </w:r>
-    </w:p>
-    <w:p>
-      <w:pPr>
-        <w:pStyle w:val="ExampleBlock"/>
-      </w:pPr>
-      <w:r>
-        <w:t xml:space="preserve">You report on a ai review repurposing service. Here is this week's activity: [prospects contacted, replies, jobs booked, jobs delivered, revenue, issues]. Produce two outputs: (1) an internal summary with the top three numbers and the one bottleneck to fix next week; (2) a short, friendly update for each active client stating what was done, what is next, and any approval needed. Keep every claim factual and flag anything that needs owner approval.</w:t>
-      </w:r>
-    </w:p>
-    <w:p>
-      <w:pPr>
-        <w:pStyle w:val="Heading1"/>
-      </w:pPr>
-      <w:r>
-        <w:t xml:space="preserve">09 / Proof and referral repurposing - runs after each completed job</w:t>
-      </w:r>
-    </w:p>
-    <w:p>
-      <w:pPr>
-        <w:pStyle w:val="ExampleBlock"/>
-      </w:pPr>
-      <w:r>
-        <w:t xml:space="preserve">You repurpose finished work for a ai review repurposing service. Here are the job details and before/after notes: [paste]. Draft: one social caption with the result and a soft call to action, one short message asking the client for a referral or review, and one line to add this example to the outreach sample library. Do not invent results or show identifying details without approval.</w:t>
-      </w:r>
-    </w:p>
-    <w:p>
-      <w:pPr>
-        <w:pStyle w:val="Heading1"/>
-      </w:pPr>
-      <w:r>
-        <w:t xml:space="preserve">10 / Delivery standards (shared)</w:t>
+        <w:t xml:space="preserve">02 / Minimum viable weekly loop</w:t>
       </w:r>
     </w:p>
     <w:p>
@@ -1744,7 +1403,7 @@
         </w:numPr>
       </w:pPr>
       <w:r>
-        <w:t xml:space="preserve">This asset is for local businesses; replace bracketed fields with their specifics before sending.</w:t>
+        <w:t xml:space="preserve">1. Collect: import only new reviews from the agreed public sources or client export.</w:t>
       </w:r>
     </w:p>
     <w:p>
@@ -1756,7 +1415,7 @@
         </w:numPr>
       </w:pPr>
       <w:r>
-        <w:t xml:space="preserve">Full delivery standards - inputs to collect, evidence capture, pricing and scope guardrails, and the pre-send QA list - live once in this pack's AI Prompt Pack.</w:t>
+        <w:t xml:space="preserve">2. Classify: mark positive, neutral, routine negative, or escalate before drafting.</w:t>
       </w:r>
     </w:p>
     <w:p>
@@ -1768,7 +1427,7 @@
         </w:numPr>
       </w:pPr>
       <w:r>
-        <w:t xml:space="preserve">Verify every fact, price, date, hour, link, and claim against a source, and keep approvals in writing.</w:t>
+        <w:t xml:space="preserve">3. Draft: prepare a short owner-voice reply using only approved business facts.</w:t>
       </w:r>
     </w:p>
     <w:p>
@@ -1780,20 +1439,271 @@
         </w:numPr>
       </w:pPr>
       <w:r>
+        <w:t xml:space="preserve">4. Extract: copy the strongest customer phrase exactly and retain its source URL.</w:t>
+      </w:r>
+    </w:p>
+    <w:p>
+      <w:pPr>
+        <w:pStyle w:val="ListParagraph"/>
+        <w:numPr>
+          <w:ilvl w:val="0"/>
+          <w:numId w:val="1"/>
+        </w:numPr>
+      </w:pPr>
+      <w:r>
+        <w:t xml:space="preserve">5. Gate: stop on privacy, safety, medical, legal, discrimination, refund, staff, or disputed-fact issues.</w:t>
+      </w:r>
+    </w:p>
+    <w:p>
+      <w:pPr>
+        <w:pStyle w:val="ListParagraph"/>
+        <w:numPr>
+          <w:ilvl w:val="0"/>
+          <w:numId w:val="1"/>
+        </w:numPr>
+      </w:pPr>
+      <w:r>
+        <w:t xml:space="preserve">6. Approve: send one batch to the named owner for reply and testimonial-use approval.</w:t>
+      </w:r>
+    </w:p>
+    <w:p>
+      <w:pPr>
+        <w:pStyle w:val="ListParagraph"/>
+        <w:numPr>
+          <w:ilvl w:val="0"/>
+          <w:numId w:val="1"/>
+        </w:numPr>
+      </w:pPr>
+      <w:r>
+        <w:t xml:space="preserve">7. Package: map approved wording into social, website, email, and sales-graphic copy blocks.</w:t>
+      </w:r>
+    </w:p>
+    <w:p>
+      <w:pPr>
+        <w:pStyle w:val="Heading1"/>
+      </w:pPr>
+      <w:r>
+        <w:t xml:space="preserve">03 / Scheduled review sweep prompt</w:t>
+      </w:r>
+    </w:p>
+    <w:p>
+      <w:pPr>
+        <w:pStyle w:val="ExampleBlock"/>
+      </w:pPr>
+      <w:r>
+        <w:t xml:space="preserve">Review the new items in [APPROVED REVIEW EXPORT OR LINKS] for [BUSINESS]. Return one row per review with source URL, review date, rating, sentiment, reply priority, sensitive-risk flag, short reply draft, exact customer quote worth reusing, and suggested proof format. Use only words and facts present in the review or approved business brief. Do not browse for private information, invent context, post replies, contact reviewers, or create unsupported claims. Mark legal, medical, safety, discrimination, privacy, staff, refund, threat, or disputed-fact content ESCALATE and provide no public reply beyond a neutral owner-review note.</w:t>
+      </w:r>
+    </w:p>
+    <w:p>
+      <w:pPr>
+        <w:pStyle w:val="Heading1"/>
+      </w:pPr>
+      <w:r>
+        <w:t xml:space="preserve">04 / Exact-quote and permission gate</w:t>
+      </w:r>
+    </w:p>
+    <w:p>
+      <w:pPr>
+        <w:pStyle w:val="ListParagraph"/>
+        <w:numPr>
+          <w:ilvl w:val="0"/>
+          <w:numId w:val="1"/>
+        </w:numPr>
+      </w:pPr>
+      <w:r>
+        <w:t xml:space="preserve">Compare every proposed testimonial line against its source review. Return PASS only when the wording is exact or clearly marked as an owner-approved edit.</w:t>
+      </w:r>
+    </w:p>
+    <w:p>
+      <w:pPr>
+        <w:pStyle w:val="ListParagraph"/>
+        <w:numPr>
+          <w:ilvl w:val="0"/>
+          <w:numId w:val="1"/>
+        </w:numPr>
+      </w:pPr>
+      <w:r>
+        <w:t xml:space="preserve">Record the source URL, reviewer display name as allowed by platform rules, original wording, proposed crop, context kept, intended channel, and owner approval status.</w:t>
+      </w:r>
+    </w:p>
+    <w:p>
+      <w:pPr>
+        <w:pStyle w:val="ListParagraph"/>
+        <w:numPr>
+          <w:ilvl w:val="0"/>
+          <w:numId w:val="1"/>
+        </w:numPr>
+      </w:pPr>
+      <w:r>
+        <w:t xml:space="preserve">Do not shorten wording in a way that changes meaning. Do not imply a result, timeframe, product, location, or customer identity that the review does not support.</w:t>
+      </w:r>
+    </w:p>
+    <w:p>
+      <w:pPr>
+        <w:pStyle w:val="ListParagraph"/>
+        <w:numPr>
+          <w:ilvl w:val="0"/>
+          <w:numId w:val="1"/>
+        </w:numPr>
+      </w:pPr>
+      <w:r>
+        <w:t xml:space="preserve">Hold every proof asset until the owner confirms the business can reuse the review and approves the final wording and design context.</w:t>
+      </w:r>
+    </w:p>
+    <w:p>
+      <w:pPr>
+        <w:pStyle w:val="Heading1"/>
+      </w:pPr>
+      <w:r>
+        <w:t xml:space="preserve">05 / Monthly content pack prompt</w:t>
+      </w:r>
+    </w:p>
+    <w:p>
+      <w:pPr>
+        <w:pStyle w:val="ExampleBlock"/>
+      </w:pPr>
+      <w:r>
+        <w:t xml:space="preserve">Using only APPROVED rows in [CONTROL SHEET], prepare this month's client pack: reply drafts, five exact quotes, four social captions, four website proof blocks, four email lines, and square and story card copy. Keep the source URL and approval record beside each item. Exclude held, disputed, sensitive, or unapproved material. End with reviews processed, replies approved, items escalated, and proof blocks produced. Do not claim rating, ranking, lead, booking, or revenue impact.</w:t>
+      </w:r>
+    </w:p>
+    <w:p>
+      <w:pPr>
+        <w:pStyle w:val="Heading1"/>
+      </w:pPr>
+      <w:r>
+        <w:t xml:space="preserve">06 / Approval email draft</w:t>
+      </w:r>
+    </w:p>
+    <w:p>
+      <w:pPr>
+        <w:pStyle w:val="ExampleBlock"/>
+      </w:pPr>
+      <w:r>
+        <w:t xml:space="preserve">Draft one email to [APPROVAL OWNER] linking the review log and content pack. Group items into APPROVE, EDIT, and HOLD. List sensitive items separately with no recommendation beyond owner review. Ask the owner to confirm the reply wording, testimonial-use permission, business facts, design context, and channels before anything is posted. Save as a draft and do not send.</w:t>
+      </w:r>
+    </w:p>
+    <w:p>
+      <w:pPr>
+        <w:pStyle w:val="Heading1"/>
+      </w:pPr>
+      <w:r>
+        <w:t xml:space="preserve">07 / First 20 leads routine</w:t>
+      </w:r>
+    </w:p>
+    <w:p>
+      <w:pPr>
+        <w:pStyle w:val="ExampleBlock"/>
+      </w:pPr>
+      <w:r>
+        <w:t xml:space="preserve">Once a week, review 20 public local-business profiles in [AREA OR NICHE]. Return only businesses with strong recent reviews plus visible reply gaps or unused proof. For each, record the public profile URL, two specific observations, one safe three-review sample angle, and the best public contact channel. Do not collect private data or send outreach.</w:t>
+      </w:r>
+    </w:p>
+    <w:p>
+      <w:pPr>
+        <w:pStyle w:val="ExampleBlock"/>
+      </w:pPr>
+      <w:r>
+        <w:t xml:space="preserve">For the five strongest prospects, draft a message under 70 words offering a three-review sample. Mention one real visible pattern, not AI. Keep every message in drafts for human review.</w:t>
+      </w:r>
+    </w:p>
+    <w:p>
+      <w:pPr>
+        <w:pStyle w:val="Heading1"/>
+      </w:pPr>
+      <w:r>
+        <w:t xml:space="preserve">08 / Failure and safety rules</w:t>
+      </w:r>
+    </w:p>
+    <w:p>
+      <w:pPr>
+        <w:pStyle w:val="ListParagraph"/>
+        <w:numPr>
+          <w:ilvl w:val="0"/>
+          <w:numId w:val="1"/>
+        </w:numPr>
+      </w:pPr>
+      <w:r>
+        <w:t xml:space="preserve">Stop when the review source cannot be verified, wording is ambiguous, a complaint includes sensitive claims, owner approval is missing, or reuse rights are unclear.</w:t>
+      </w:r>
+    </w:p>
+    <w:p>
+      <w:pPr>
+        <w:pStyle w:val="ListParagraph"/>
+        <w:numPr>
+          <w:ilvl w:val="0"/>
+          <w:numId w:val="1"/>
+        </w:numPr>
+      </w:pPr>
+      <w:r>
+        <w:t xml:space="preserve">Do not automate public posting, reviewer contact, review requests, review gating, incentives, removals, dispute submissions, crisis replies, or testimonial publishing.</w:t>
+      </w:r>
+    </w:p>
+    <w:p>
+      <w:pPr>
+        <w:pStyle w:val="ListParagraph"/>
+        <w:numPr>
+          <w:ilvl w:val="0"/>
+          <w:numId w:val="1"/>
+        </w:numPr>
+      </w:pPr>
+      <w:r>
+        <w:t xml:space="preserve">Log the source, run date, draft, risk decision, human approver, approved wording, intended channel, and final filename for every item.</w:t>
+      </w:r>
+    </w:p>
+    <w:p>
+      <w:pPr>
+        <w:pStyle w:val="Heading1"/>
+      </w:pPr>
+      <w:r>
+        <w:t xml:space="preserve">09 / Delivery standards (shared)</w:t>
+      </w:r>
+    </w:p>
+    <w:p>
+      <w:pPr>
+        <w:pStyle w:val="ListParagraph"/>
+        <w:numPr>
+          <w:ilvl w:val="0"/>
+          <w:numId w:val="1"/>
+        </w:numPr>
+      </w:pPr>
+      <w:r>
+        <w:t xml:space="preserve">This asset is for local businesses; replace bracketed fields with their specifics before sending.</w:t>
+      </w:r>
+    </w:p>
+    <w:p>
+      <w:pPr>
+        <w:pStyle w:val="ListParagraph"/>
+        <w:numPr>
+          <w:ilvl w:val="0"/>
+          <w:numId w:val="1"/>
+        </w:numPr>
+      </w:pPr>
+      <w:r>
+        <w:t xml:space="preserve">Full delivery standards - inputs to collect, evidence capture, pricing and scope guardrails, and the pre-send QA list - live once in this pack's AI Prompt Pack.</w:t>
+      </w:r>
+    </w:p>
+    <w:p>
+      <w:pPr>
+        <w:pStyle w:val="ListParagraph"/>
+        <w:numPr>
+          <w:ilvl w:val="0"/>
+          <w:numId w:val="1"/>
+        </w:numPr>
+      </w:pPr>
+      <w:r>
+        <w:t xml:space="preserve">Verify every fact, price, date, hour, link, and claim against a source, and keep approvals in writing.</w:t>
+      </w:r>
+    </w:p>
+    <w:p>
+      <w:pPr>
+        <w:pStyle w:val="ListParagraph"/>
+        <w:numPr>
+          <w:ilvl w:val="0"/>
+          <w:numId w:val="1"/>
+        </w:numPr>
+      </w:pPr>
+      <w:r>
         <w:t xml:space="preserve">Never imply guaranteed revenue, rankings, bookings, retention, or ad performance.</w:t>
-      </w:r>
-    </w:p>
-    <w:p>
-      <w:pPr>
-        <w:pStyle w:val="Heading1"/>
-      </w:pPr>
-      <w:r>
-        <w:t xml:space="preserve">Commercial use note</w:t>
-      </w:r>
-    </w:p>
-    <w:p>
-      <w:r>
-        <w:t xml:space="preserve">These templates are practical launch materials. They do not guarantee revenue, rankings, retention, or advertising performance. Validate claims with buyer data and keep approvals in writing.</w:t>
       </w:r>
     </w:p>
     <w:sectPr>

</xml_diff>